<commit_message>
adicionar docx e pdf
</commit_message>
<xml_diff>
--- a/labs/lab03/report/report.docx
+++ b/labs/lab03/report/report.docx
@@ -2,500 +2,110 @@
 <file path=word/document.xml><?xml version="1.0" encoding="utf-8"?>
 <w:document xmlns:w="http://schemas.openxmlformats.org/wordprocessingml/2006/main" xmlns:m="http://schemas.openxmlformats.org/officeDocument/2006/math" xmlns:r="http://schemas.openxmlformats.org/officeDocument/2006/relationships" xmlns:o="urn:schemas-microsoft-com:office:office" xmlns:v="urn:schemas-microsoft-com:vml" xmlns:w10="urn:schemas-microsoft-com:office:word" xmlns:a="http://schemas.openxmlformats.org/drawingml/2006/main" xmlns:pic="http://schemas.openxmlformats.org/drawingml/2006/picture" xmlns:wp="http://schemas.openxmlformats.org/drawingml/2006/wordprocessingDrawing">
   <w:body>
-    <w:tbl>
-      <w:tblPr>
-        <w:tblStyle w:val="Table"/>
-        <w:tblW w:type="pct" w:w="208"/>
-        <w:jc w:val="left"/>
-        <w:tblLayout w:type="fixed"/>
-        <w:tblLook w:firstRow="0" w:lastRow="0" w:firstColumn="0" w:lastColumn="0" w:noHBand="0" w:noVBand="0" w:val="0000"/>
-      </w:tblPr>
-      <w:tblGrid>
-        <w:gridCol w:w="330"/>
-      </w:tblGrid>
-      <w:tr>
-        <w:tc>
-          <w:tcPr/>
-          <w:p>
-            <w:pPr>
-              <w:pStyle w:val="Compact"/>
-              <w:jc w:val="left"/>
-            </w:pPr>
-            <w:r>
-              <w:t xml:space="preserve">## Front matter</w:t>
-            </w:r>
-            <w:r>
-              <w:t xml:space="preserve"> </w:t>
-            </w:r>
-            <w:r>
-              <w:t xml:space="preserve">title:</w:t>
-            </w:r>
-            <w:r>
-              <w:t xml:space="preserve"> </w:t>
-            </w:r>
-            <w:r>
-              <w:t xml:space="preserve">“</w:t>
-            </w:r>
-            <w:r>
-              <w:t xml:space="preserve">Отчёт по лабораторной работе №3</w:t>
-            </w:r>
-            <w:r>
-              <w:t xml:space="preserve">”</w:t>
-            </w:r>
-            <w:r>
-              <w:t xml:space="preserve"> </w:t>
-            </w:r>
-            <w:r>
-              <w:t xml:space="preserve">subtitle:</w:t>
-            </w:r>
-            <w:r>
-              <w:t xml:space="preserve"> </w:t>
-            </w:r>
-            <w:r>
-              <w:t xml:space="preserve">“</w:t>
-            </w:r>
-            <w:r>
-              <w:t xml:space="preserve">Язык разметки Markdown</w:t>
-            </w:r>
-            <w:r>
-              <w:t xml:space="preserve">”</w:t>
-            </w:r>
-            <w:r>
-              <w:t xml:space="preserve"> </w:t>
-            </w:r>
-            <w:r>
-              <w:t xml:space="preserve">author:</w:t>
-            </w:r>
-            <w:r>
-              <w:t xml:space="preserve"> </w:t>
-            </w:r>
-            <w:r>
-              <w:t xml:space="preserve">“</w:t>
-            </w:r>
-            <w:r>
-              <w:t xml:space="preserve">Маркеш Виейра Нанке Грасимилде</w:t>
-            </w:r>
-            <w:r>
-              <w:t xml:space="preserve">”</w:t>
-            </w:r>
-          </w:p>
-        </w:tc>
-      </w:tr>
-      <w:tr>
-        <w:tc>
-          <w:tcPr/>
-          <w:p>
-            <w:pPr>
-              <w:pStyle w:val="Compact"/>
-              <w:jc w:val="left"/>
-            </w:pPr>
-            <w:r>
-              <w:t xml:space="preserve">## Generic otions</w:t>
-            </w:r>
-            <w:r>
-              <w:t xml:space="preserve"> </w:t>
-            </w:r>
-            <w:r>
-              <w:t xml:space="preserve">lang: ru-RU</w:t>
-            </w:r>
-            <w:r>
-              <w:t xml:space="preserve"> </w:t>
-            </w:r>
-            <w:r>
-              <w:t xml:space="preserve">toc-title:</w:t>
-            </w:r>
-            <w:r>
-              <w:t xml:space="preserve"> </w:t>
-            </w:r>
-            <w:r>
-              <w:t xml:space="preserve">“</w:t>
-            </w:r>
-            <w:r>
-              <w:t xml:space="preserve">Содержание</w:t>
-            </w:r>
-            <w:r>
-              <w:t xml:space="preserve">”</w:t>
-            </w:r>
-          </w:p>
-        </w:tc>
-      </w:tr>
-      <w:tr>
-        <w:tc>
-          <w:tcPr/>
-          <w:p>
-            <w:pPr>
-              <w:pStyle w:val="Compact"/>
-              <w:jc w:val="left"/>
-            </w:pPr>
-            <w:r>
-              <w:t xml:space="preserve">## Bibliography</w:t>
-            </w:r>
-            <w:r>
-              <w:t xml:space="preserve"> </w:t>
-            </w:r>
-            <w:r>
-              <w:t xml:space="preserve">bibliography: bib/cite.bib</w:t>
-            </w:r>
-            <w:r>
-              <w:t xml:space="preserve"> </w:t>
-            </w:r>
-            <w:r>
-              <w:t xml:space="preserve"># csl: pandoc/csl/gost-r-7-0-5-2008-numeric.csl</w:t>
-            </w:r>
-          </w:p>
-        </w:tc>
-      </w:tr>
-      <w:tr>
-        <w:tc>
-          <w:tcPr/>
-          <w:p>
-            <w:pPr>
-              <w:pStyle w:val="Compact"/>
-              <w:jc w:val="left"/>
-            </w:pPr>
-            <w:r>
-              <w:t xml:space="preserve">## Pdf output format</w:t>
-            </w:r>
-            <w:r>
-              <w:t xml:space="preserve"> </w:t>
-            </w:r>
-            <w:r>
-              <w:t xml:space="preserve">toc: true # Table of contents</w:t>
-            </w:r>
-            <w:r>
-              <w:t xml:space="preserve"> </w:t>
-            </w:r>
-            <w:r>
-              <w:t xml:space="preserve">toc-depth: 2</w:t>
-            </w:r>
-            <w:r>
-              <w:t xml:space="preserve"> </w:t>
-            </w:r>
-            <w:r>
-              <w:t xml:space="preserve">lof: true # List of figures</w:t>
-            </w:r>
-            <w:r>
-              <w:t xml:space="preserve"> </w:t>
-            </w:r>
-            <w:r>
-              <w:t xml:space="preserve">fontsize: 12pt</w:t>
-            </w:r>
-            <w:r>
-              <w:t xml:space="preserve"> </w:t>
-            </w:r>
-            <w:r>
-              <w:t xml:space="preserve">linestretch: 1.5</w:t>
-            </w:r>
-            <w:r>
-              <w:t xml:space="preserve"> </w:t>
-            </w:r>
-            <w:r>
-              <w:t xml:space="preserve">papersize: a4</w:t>
-            </w:r>
-            <w:r>
-              <w:t xml:space="preserve"> </w:t>
-            </w:r>
-            <w:r>
-              <w:t xml:space="preserve">documentclass: scrreprt</w:t>
-            </w:r>
-            <w:r>
-              <w:t xml:space="preserve"> </w:t>
-            </w:r>
-            <w:r>
-              <w:t xml:space="preserve">## I18n polyglossia</w:t>
-            </w:r>
-            <w:r>
-              <w:t xml:space="preserve"> </w:t>
-            </w:r>
-            <w:r>
-              <w:t xml:space="preserve">polyglossia-lang:</w:t>
-            </w:r>
-            <w:r>
-              <w:t xml:space="preserve"> </w:t>
-            </w:r>
-            <w:r>
-              <w:t xml:space="preserve">name: russian</w:t>
-            </w:r>
-            <w:r>
-              <w:t xml:space="preserve"> </w:t>
-            </w:r>
-            <w:r>
-              <w:t xml:space="preserve">options:</w:t>
-            </w:r>
-            <w:r>
-              <w:t xml:space="preserve"> </w:t>
-            </w:r>
-            <w:r>
-              <w:t xml:space="preserve">- spelling=modern</w:t>
-            </w:r>
-            <w:r>
-              <w:t xml:space="preserve"> </w:t>
-            </w:r>
-            <w:r>
-              <w:t xml:space="preserve">- babelshorthands=true</w:t>
-            </w:r>
-            <w:r>
-              <w:t xml:space="preserve"> </w:t>
-            </w:r>
-            <w:r>
-              <w:t xml:space="preserve">polyglossia-otherlangs:</w:t>
-            </w:r>
-            <w:r>
-              <w:t xml:space="preserve"> </w:t>
-            </w:r>
-            <w:r>
-              <w:t xml:space="preserve">name: english</w:t>
-            </w:r>
-            <w:r>
-              <w:t xml:space="preserve"> </w:t>
-            </w:r>
-            <w:r>
-              <w:t xml:space="preserve">## I18n babel</w:t>
-            </w:r>
-            <w:r>
-              <w:t xml:space="preserve"> </w:t>
-            </w:r>
-            <w:r>
-              <w:t xml:space="preserve">babel-lang: russian</w:t>
-            </w:r>
-            <w:r>
-              <w:t xml:space="preserve"> </w:t>
-            </w:r>
-            <w:r>
-              <w:t xml:space="preserve">babel-otherlangs: english</w:t>
-            </w:r>
-            <w:r>
-              <w:t xml:space="preserve"> </w:t>
-            </w:r>
-            <w:r>
-              <w:t xml:space="preserve">## Fonts</w:t>
-            </w:r>
-            <w:r>
-              <w:t xml:space="preserve"> </w:t>
-            </w:r>
-            <w:r>
-              <w:t xml:space="preserve">mainfont: Liberation Serif</w:t>
-            </w:r>
-            <w:r>
-              <w:t xml:space="preserve"> </w:t>
-            </w:r>
-            <w:r>
-              <w:t xml:space="preserve">romanfont: Liberation Serif</w:t>
-            </w:r>
-            <w:r>
-              <w:t xml:space="preserve"> </w:t>
-            </w:r>
-            <w:r>
-              <w:t xml:space="preserve">sansfont: Liberation Sans</w:t>
-            </w:r>
-            <w:r>
-              <w:t xml:space="preserve"> </w:t>
-            </w:r>
-            <w:r>
-              <w:t xml:space="preserve">monofont: Liberation Mono</w:t>
-            </w:r>
-            <w:r>
-              <w:t xml:space="preserve"> </w:t>
-            </w:r>
-            <w:r>
-              <w:t xml:space="preserve">mainfontoptions: Ligatures=TeX</w:t>
-            </w:r>
-            <w:r>
-              <w:t xml:space="preserve"> </w:t>
-            </w:r>
-            <w:r>
-              <w:t xml:space="preserve">romanfontoptions: Ligatures=TeX</w:t>
-            </w:r>
-            <w:r>
-              <w:t xml:space="preserve"> </w:t>
-            </w:r>
-            <w:r>
-              <w:t xml:space="preserve">sansfontoptions: Ligatures=TeX,Scale=MatchLowercase</w:t>
-            </w:r>
-            <w:r>
-              <w:t xml:space="preserve"> </w:t>
-            </w:r>
-            <w:r>
-              <w:t xml:space="preserve">monofontoptions: Scale=MatchLowercase,Scale=0.9</w:t>
-            </w:r>
-            <w:r>
-              <w:t xml:space="preserve"> </w:t>
-            </w:r>
-            <w:r>
-              <w:t xml:space="preserve">## Biblatex</w:t>
-            </w:r>
-            <w:r>
-              <w:t xml:space="preserve"> </w:t>
-            </w:r>
-            <w:r>
-              <w:t xml:space="preserve">biblatex: true</w:t>
-            </w:r>
-            <w:r>
-              <w:t xml:space="preserve"> </w:t>
-            </w:r>
-            <w:r>
-              <w:t xml:space="preserve">biblio-style:</w:t>
-            </w:r>
-            <w:r>
-              <w:t xml:space="preserve"> </w:t>
-            </w:r>
-            <w:r>
-              <w:t xml:space="preserve">“</w:t>
-            </w:r>
-            <w:r>
-              <w:t xml:space="preserve">gost-numeric</w:t>
-            </w:r>
-            <w:r>
-              <w:t xml:space="preserve">”</w:t>
-            </w:r>
-            <w:r>
-              <w:t xml:space="preserve"> </w:t>
-            </w:r>
-            <w:r>
-              <w:t xml:space="preserve">biblatexoptions:</w:t>
-            </w:r>
-            <w:r>
-              <w:t xml:space="preserve"> </w:t>
-            </w:r>
-            <w:r>
-              <w:t xml:space="preserve">- parentracker=true</w:t>
-            </w:r>
-            <w:r>
-              <w:t xml:space="preserve"> </w:t>
-            </w:r>
-            <w:r>
-              <w:t xml:space="preserve">- backend=biber</w:t>
-            </w:r>
-            <w:r>
-              <w:t xml:space="preserve"> </w:t>
-            </w:r>
-            <w:r>
-              <w:t xml:space="preserve">- hyperref=auto</w:t>
-            </w:r>
-            <w:r>
-              <w:t xml:space="preserve"> </w:t>
-            </w:r>
-            <w:r>
-              <w:t xml:space="preserve">- language=auto</w:t>
-            </w:r>
-            <w:r>
-              <w:t xml:space="preserve"> </w:t>
-            </w:r>
-            <w:r>
-              <w:t xml:space="preserve">- autolang=other*</w:t>
-            </w:r>
-            <w:r>
-              <w:t xml:space="preserve"> </w:t>
-            </w:r>
-            <w:r>
-              <w:t xml:space="preserve">- citestyle=gost-numeric</w:t>
-            </w:r>
-            <w:r>
-              <w:t xml:space="preserve"> </w:t>
-            </w:r>
-            <w:r>
-              <w:t xml:space="preserve">## Pandoc-crossref LaTeX customization</w:t>
-            </w:r>
-            <w:r>
-              <w:t xml:space="preserve"> </w:t>
-            </w:r>
-            <w:r>
-              <w:t xml:space="preserve">figureTitle:</w:t>
-            </w:r>
-            <w:r>
-              <w:t xml:space="preserve"> </w:t>
-            </w:r>
-            <w:r>
-              <w:t xml:space="preserve">“</w:t>
-            </w:r>
-            <w:r>
-              <w:t xml:space="preserve">Рис.</w:t>
-            </w:r>
-            <w:r>
-              <w:t xml:space="preserve">”</w:t>
-            </w:r>
-            <w:r>
-              <w:t xml:space="preserve"> </w:t>
-            </w:r>
-            <w:r>
-              <w:t xml:space="preserve">listingTitle:</w:t>
-            </w:r>
-            <w:r>
-              <w:t xml:space="preserve"> </w:t>
-            </w:r>
-            <w:r>
-              <w:t xml:space="preserve">“</w:t>
-            </w:r>
-            <w:r>
-              <w:t xml:space="preserve">Листинг</w:t>
-            </w:r>
-            <w:r>
-              <w:t xml:space="preserve">”</w:t>
-            </w:r>
-            <w:r>
-              <w:t xml:space="preserve"> </w:t>
-            </w:r>
-            <w:r>
-              <w:t xml:space="preserve">lofTitle:</w:t>
-            </w:r>
-            <w:r>
-              <w:t xml:space="preserve"> </w:t>
-            </w:r>
-            <w:r>
-              <w:t xml:space="preserve">“</w:t>
-            </w:r>
-            <w:r>
-              <w:t xml:space="preserve">Список иллюстраций</w:t>
-            </w:r>
-            <w:r>
-              <w:t xml:space="preserve">”</w:t>
-            </w:r>
-            <w:r>
-              <w:t xml:space="preserve"> </w:t>
-            </w:r>
-            <w:r>
-              <w:t xml:space="preserve">lolTitle:</w:t>
-            </w:r>
-            <w:r>
-              <w:t xml:space="preserve"> </w:t>
-            </w:r>
-            <w:r>
-              <w:t xml:space="preserve">“</w:t>
-            </w:r>
-            <w:r>
-              <w:t xml:space="preserve">Листинги</w:t>
-            </w:r>
-            <w:r>
-              <w:t xml:space="preserve">”</w:t>
-            </w:r>
-            <w:r>
-              <w:t xml:space="preserve"> </w:t>
-            </w:r>
-            <w:r>
-              <w:t xml:space="preserve">## Misc options</w:t>
-            </w:r>
-            <w:r>
-              <w:t xml:space="preserve"> </w:t>
-            </w:r>
-            <w:r>
-              <w:t xml:space="preserve">indent: true</w:t>
-            </w:r>
-            <w:r>
-              <w:t xml:space="preserve"> </w:t>
-            </w:r>
-            <w:r>
-              <w:t xml:space="preserve">header-includes:</w:t>
-            </w:r>
-            <w:r>
-              <w:t xml:space="preserve"> </w:t>
-            </w:r>
-            <w:r>
-              <w:t xml:space="preserve">-</w:t>
-            </w:r>
-          </w:p>
-        </w:tc>
-      </w:tr>
-    </w:tbl>
+    <w:p>
+      <w:pPr>
+        <w:pStyle w:val="Title"/>
+      </w:pPr>
+      <w:r>
+        <w:t xml:space="preserve">Отчет</w:t>
+      </w:r>
+      <w:r>
+        <w:t xml:space="preserve"> </w:t>
+      </w:r>
+      <w:r>
+        <w:t xml:space="preserve">по</w:t>
+      </w:r>
+      <w:r>
+        <w:t xml:space="preserve"> </w:t>
+      </w:r>
+      <w:r>
+        <w:t xml:space="preserve">лабораторной</w:t>
+      </w:r>
+      <w:r>
+        <w:t xml:space="preserve"> </w:t>
+      </w:r>
+      <w:r>
+        <w:t xml:space="preserve">работе</w:t>
+      </w:r>
+      <w:r>
+        <w:t xml:space="preserve"> </w:t>
+      </w:r>
+      <w:r>
+        <w:t xml:space="preserve">№3</w:t>
+      </w:r>
+    </w:p>
+    <w:p>
+      <w:pPr>
+        <w:pStyle w:val="Subtitle"/>
+      </w:pPr>
+      <w:r>
+        <w:t xml:space="preserve">Язык</w:t>
+      </w:r>
+      <w:r>
+        <w:t xml:space="preserve"> </w:t>
+      </w:r>
+      <w:r>
+        <w:t xml:space="preserve">разметки</w:t>
+      </w:r>
+      <w:r>
+        <w:t xml:space="preserve"> </w:t>
+      </w:r>
+      <w:r>
+        <w:t xml:space="preserve">Markdown</w:t>
+      </w:r>
+    </w:p>
+    <w:p>
+      <w:pPr>
+        <w:pStyle w:val="Author"/>
+      </w:pPr>
+      <w:r>
+        <w:t xml:space="preserve">Маркеш</w:t>
+      </w:r>
+      <w:r>
+        <w:t xml:space="preserve"> </w:t>
+      </w:r>
+      <w:r>
+        <w:t xml:space="preserve">Виейра</w:t>
+      </w:r>
+      <w:r>
+        <w:t xml:space="preserve"> </w:t>
+      </w:r>
+      <w:r>
+        <w:t xml:space="preserve">Нанке</w:t>
+      </w:r>
+      <w:r>
+        <w:t xml:space="preserve"> </w:t>
+      </w:r>
+      <w:r>
+        <w:t xml:space="preserve">Грасимилде</w:t>
+      </w:r>
+    </w:p>
+    <w:sdt>
+      <w:sdtPr>
+        <w:docPartObj>
+          <w:docPartGallery w:val="Table of Contents"/>
+          <w:docPartUnique/>
+        </w:docPartObj>
+      </w:sdtPr>
+      <w:sdtContent>
+        <w:p>
+          <w:pPr>
+            <w:pStyle w:val="TOCHeading"/>
+          </w:pPr>
+          <w:r>
+            <w:t xml:space="preserve">Содержание</w:t>
+          </w:r>
+        </w:p>
+        <w:p>
+          <w:r>
+            <w:fldChar w:fldCharType="begin" w:dirty="true"/>
+            <w:instrText xml:space="preserve">TOC \o "1-3" \h \z \u</w:instrText>
+            <w:fldChar w:fldCharType="separate"/>
+            <w:fldChar w:fldCharType="end"/>
+          </w:r>
+        </w:p>
+      </w:sdtContent>
+    </w:sdt>
     <w:bookmarkStart w:id="20" w:name="цель-работы"/>
     <w:p>
       <w:pPr>
@@ -606,26 +216,7 @@
         <w:pStyle w:val="FirstParagraph"/>
       </w:pPr>
       <w:r>
-        <w:t xml:space="preserve">Перехожу в каталог, в котором находится шаблон для отчета по лабораторной работы, с помощью утилиты cd (рис.</w:t>
-      </w:r>
-      <w:r>
-        <w:t xml:space="preserve"> </w:t>
-      </w:r>
-      <w:r>
-        <w:t xml:space="preserve">(</w:t>
-      </w:r>
-      <w:r>
-        <w:rPr>
-          <w:b/>
-          <w:bCs/>
-        </w:rPr>
-        <w:t xml:space="preserve">fig:001?</w:t>
-      </w:r>
-      <w:r>
-        <w:t xml:space="preserve">)</w:t>
-      </w:r>
-      <w:r>
-        <w:t xml:space="preserve">).</w:t>
+        <w:t xml:space="preserve">Перехожу в каталог, в котором находится шаблон для отчета по лабораторной работы, с помощью утилиты cd (рис. fig. 1).</w:t>
       </w:r>
     </w:p>
     <w:p>
@@ -680,7 +271,7 @@
         <w:pStyle w:val="ImageCaption"/>
       </w:pPr>
       <w:r>
-        <w:t xml:space="preserve">Перемещение между директориями</w:t>
+        <w:t xml:space="preserve">Рис. 1: Перемещение между директориями</w:t>
       </w:r>
     </w:p>
     <w:p>
@@ -688,26 +279,7 @@
         <w:pStyle w:val="BodyText"/>
       </w:pPr>
       <w:r>
-        <w:t xml:space="preserve">Создаю копию шаблона, в которой буду работать с помощью утилиты cp (рис.</w:t>
-      </w:r>
-      <w:r>
-        <w:t xml:space="preserve"> </w:t>
-      </w:r>
-      <w:r>
-        <w:t xml:space="preserve">(</w:t>
-      </w:r>
-      <w:r>
-        <w:rPr>
-          <w:b/>
-          <w:bCs/>
-        </w:rPr>
-        <w:t xml:space="preserve">fig:002?</w:t>
-      </w:r>
-      <w:r>
-        <w:t xml:space="preserve">)</w:t>
-      </w:r>
-      <w:r>
-        <w:t xml:space="preserve">).</w:t>
+        <w:t xml:space="preserve">Создаю копию шаблона, в которой буду работать с помощью утилиты cp (рис. fig. 2).</w:t>
       </w:r>
     </w:p>
     <w:p>
@@ -762,7 +334,7 @@
         <w:pStyle w:val="ImageCaption"/>
       </w:pPr>
       <w:r>
-        <w:t xml:space="preserve">Копирование файла</w:t>
+        <w:t xml:space="preserve">Рис. 2: Копирование файла</w:t>
       </w:r>
     </w:p>
     <w:p>
@@ -770,26 +342,7 @@
         <w:pStyle w:val="BodyText"/>
       </w:pPr>
       <w:r>
-        <w:t xml:space="preserve">Открываю созданный файл с помощью текстового редактора Gedit (можно открыть с помощью редактора Kwrite или Mousepad) (рис.</w:t>
-      </w:r>
-      <w:r>
-        <w:t xml:space="preserve"> </w:t>
-      </w:r>
-      <w:r>
-        <w:t xml:space="preserve">(</w:t>
-      </w:r>
-      <w:r>
-        <w:rPr>
-          <w:b/>
-          <w:bCs/>
-        </w:rPr>
-        <w:t xml:space="preserve">fig:003?</w:t>
-      </w:r>
-      <w:r>
-        <w:t xml:space="preserve">)</w:t>
-      </w:r>
-      <w:r>
-        <w:t xml:space="preserve">).</w:t>
+        <w:t xml:space="preserve">Открываю созданный файл с помощью текстового редактора Gedit (можно открыть с помощью редактора Kwrite или Mousepad) (рис. fig. 3).</w:t>
       </w:r>
     </w:p>
     <w:p>
@@ -844,7 +397,7 @@
         <w:pStyle w:val="ImageCaption"/>
       </w:pPr>
       <w:r>
-        <w:t xml:space="preserve">Изменение файла</w:t>
+        <w:t xml:space="preserve">Рис. 3: Изменение файла</w:t>
       </w:r>
     </w:p>
     <w:p>
@@ -852,26 +405,7 @@
         <w:pStyle w:val="BodyText"/>
       </w:pPr>
       <w:r>
-        <w:t xml:space="preserve">После изменения шаблона в соответсвии с языком разметки Markdown, я выполнила его компиляцию из формата md в форматы docx и pdf (рис.</w:t>
-      </w:r>
-      <w:r>
-        <w:t xml:space="preserve"> </w:t>
-      </w:r>
-      <w:r>
-        <w:t xml:space="preserve">(</w:t>
-      </w:r>
-      <w:r>
-        <w:rPr>
-          <w:b/>
-          <w:bCs/>
-        </w:rPr>
-        <w:t xml:space="preserve">fig:004?</w:t>
-      </w:r>
-      <w:r>
-        <w:t xml:space="preserve">)</w:t>
-      </w:r>
-      <w:r>
-        <w:t xml:space="preserve">).</w:t>
+        <w:t xml:space="preserve">После изменения шаблона в соответсвии с языком разметки Markdown, я выполнила его компиляцию из формата md в форматы docx и pdf (рис. fig. 4).</w:t>
       </w:r>
     </w:p>
     <w:p>
@@ -926,7 +460,7 @@
         <w:pStyle w:val="ImageCaption"/>
       </w:pPr>
       <w:r>
-        <w:t xml:space="preserve">Компиляция отчета</w:t>
+        <w:t xml:space="preserve">Рис. 4: Компиляция отчета</w:t>
       </w:r>
     </w:p>
     <w:p>
@@ -934,26 +468,7 @@
         <w:pStyle w:val="BodyText"/>
       </w:pPr>
       <w:r>
-        <w:t xml:space="preserve">Далее я отправила созданные и скомпилированные файлы на глобальный репозиторий (рис.</w:t>
-      </w:r>
-      <w:r>
-        <w:t xml:space="preserve"> </w:t>
-      </w:r>
-      <w:r>
-        <w:t xml:space="preserve">(</w:t>
-      </w:r>
-      <w:r>
-        <w:rPr>
-          <w:b/>
-          <w:bCs/>
-        </w:rPr>
-        <w:t xml:space="preserve">fig:005?</w:t>
-      </w:r>
-      <w:r>
-        <w:t xml:space="preserve">)</w:t>
-      </w:r>
-      <w:r>
-        <w:t xml:space="preserve">).</w:t>
+        <w:t xml:space="preserve">Далее я отправила созданные и скомпилированные файлы на глобальный репозиторий (рис. fig. 5).</w:t>
       </w:r>
     </w:p>
     <w:p>
@@ -1008,7 +523,7 @@
         <w:pStyle w:val="ImageCaption"/>
       </w:pPr>
       <w:r>
-        <w:t xml:space="preserve">Отправка файлов на Git</w:t>
+        <w:t xml:space="preserve">Рис. 5: Отправка файлов на Git</w:t>
       </w:r>
     </w:p>
     <w:p>
@@ -1016,26 +531,7 @@
         <w:pStyle w:val="BodyText"/>
       </w:pPr>
       <w:r>
-        <w:t xml:space="preserve">Последнее действие это отправка с помощью команды git push (рис.</w:t>
-      </w:r>
-      <w:r>
-        <w:t xml:space="preserve"> </w:t>
-      </w:r>
-      <w:r>
-        <w:t xml:space="preserve">(</w:t>
-      </w:r>
-      <w:r>
-        <w:rPr>
-          <w:b/>
-          <w:bCs/>
-        </w:rPr>
-        <w:t xml:space="preserve">fig:006?</w:t>
-      </w:r>
-      <w:r>
-        <w:t xml:space="preserve">)</w:t>
-      </w:r>
-      <w:r>
-        <w:t xml:space="preserve">).</w:t>
+        <w:t xml:space="preserve">Последнее действие это отправка с помощью команды git push (рис. fig. 6).</w:t>
       </w:r>
     </w:p>
     <w:p>
@@ -1090,7 +586,7 @@
         <w:pStyle w:val="ImageCaption"/>
       </w:pPr>
       <w:r>
-        <w:t xml:space="preserve">Отправка файлов на Git</w:t>
+        <w:t xml:space="preserve">Рис. 6: Отправка файлов на Git</w:t>
       </w:r>
     </w:p>
     <w:bookmarkEnd w:id="41"/>
@@ -1260,7 +756,7 @@
         <w:rFonts w:asciiTheme="minorHAnsi" w:cstheme="minorBidi" w:eastAsiaTheme="minorHAnsi" w:hAnsiTheme="minorHAnsi"/>
         <w:sz w:val="24"/>
         <w:szCs w:val="24"/>
-        <w:lang w:bidi="ar-SA" w:eastAsia="en-US" w:val="en-US"/>
+        <w:lang w:bidi="ar-SA" w:eastAsia="en-US" w:val="ru-RU"/>
       </w:rPr>
     </w:rPrDefault>
     <w:pPrDefault>

</xml_diff>